<commit_message>
Add session copy drafts to fix checklist; launch date 14 Oct
Co-Authored-By: Claude Sonnet 5.5 <noreply@anthropic.com>
Claude-Session: https://claude.ai/code/session_01VGNF22YqMhet38GotcC9rv
</commit_message>
<xml_diff>
--- a/qa/Website-Fix-and-Improve-List.docx
+++ b/qa/Website-Fix-and-Improve-List.docx
@@ -3238,6 +3238,425 @@
           <w:color w:val="BBBBBB"/>
         </w:rPr>
         <w:t>____________________________________________________________________________________________</w:t>
+      </w:r>
+    </w:p>
+    <w:p>
+      <w:r>
+        <w:br w:type="page"/>
+      </w:r>
+    </w:p>
+    <w:p>
+      <w:r>
+        <w:rPr>
+          <w:rFonts w:ascii="Aptos" w:hAnsi="Aptos"/>
+          <w:b/>
+          <w:i w:val="0"/>
+          <w:color w:val="095656"/>
+          <w:sz w:val="32"/>
+        </w:rPr>
+        <w:t>Draft copy: What you get in each session</w:t>
+      </w:r>
+    </w:p>
+    <w:p>
+      <w:r>
+        <w:rPr>
+          <w:rFonts w:ascii="Aptos" w:hAnsi="Aptos"/>
+          <w:b w:val="0"/>
+          <w:i/>
+          <w:color w:val="6B6B6B"/>
+          <w:sz w:val="18"/>
+        </w:rPr>
+        <w:t>Draft for your review. Text in [square brackets] is a placeholder. The mapping of the 8 steps to sessions is an assumption to correct.</w:t>
+      </w:r>
+    </w:p>
+    <w:p>
+      <w:pPr>
+        <w:keepNext/>
+        <w:spacing w:before="160"/>
+      </w:pPr>
+      <w:r>
+        <w:rPr>
+          <w:rFonts w:ascii="Aptos" w:hAnsi="Aptos"/>
+          <w:b/>
+          <w:i w:val="0"/>
+          <w:color w:val="C08A2E"/>
+          <w:sz w:val="22"/>
+        </w:rPr>
+        <w:t>How the two weeks work</w:t>
+      </w:r>
+    </w:p>
+    <w:p>
+      <w:r>
+        <w:rPr>
+          <w:rFonts w:ascii="Aptos" w:hAnsi="Aptos"/>
+          <w:b w:val="0"/>
+          <w:i w:val="0"/>
+        </w:rPr>
+        <w:t>Honour™ runs over two weeks: three 90-minute online sessions and two short reflections you complete in your own time. Up to nine people take part. It does not fix or prescribe. It shows you what is happening so you can decide what to do next.</w:t>
+      </w:r>
+    </w:p>
+    <w:p>
+      <w:pPr>
+        <w:keepNext/>
+        <w:spacing w:before="160"/>
+      </w:pPr>
+      <w:r>
+        <w:rPr>
+          <w:rFonts w:ascii="Aptos" w:hAnsi="Aptos"/>
+          <w:b/>
+          <w:i w:val="0"/>
+          <w:color w:val="C08A2E"/>
+          <w:sz w:val="22"/>
+        </w:rPr>
+        <w:t>Session 1: Reveal (Enter, Orient, Reveal)</w:t>
+      </w:r>
+    </w:p>
+    <w:p>
+      <w:r>
+        <w:rPr>
+          <w:rFonts w:ascii="Aptos" w:hAnsi="Aptos"/>
+          <w:b w:val="0"/>
+          <w:i w:val="0"/>
+        </w:rPr>
+        <w:t>The team gets into the room and agrees how the work will run. Then each person is asked, in a structured way, what is happening in the team beyond the meeting narratives: how work really gets done, where it stalls and where people see things differently.</w:t>
+      </w:r>
+    </w:p>
+    <w:p>
+      <w:r>
+        <w:rPr>
+          <w:rFonts w:ascii="Aptos" w:hAnsi="Aptos"/>
+          <w:b/>
+          <w:i w:val="0"/>
+          <w:color w:val="095656"/>
+        </w:rPr>
+        <w:t xml:space="preserve">What you get: </w:t>
+      </w:r>
+      <w:r>
+        <w:rPr>
+          <w:rFonts w:ascii="Aptos" w:hAnsi="Aptos"/>
+          <w:b w:val="0"/>
+          <w:i w:val="0"/>
+        </w:rPr>
+        <w:t>A first honest picture of the team, in its own words, and a shared starting point that nobody has had to argue for. [Add anything handed to the sponsor after this session.]</w:t>
+      </w:r>
+    </w:p>
+    <w:p>
+      <w:pPr>
+        <w:keepNext/>
+        <w:spacing w:before="160"/>
+      </w:pPr>
+      <w:r>
+        <w:rPr>
+          <w:rFonts w:ascii="Aptos" w:hAnsi="Aptos"/>
+          <w:b/>
+          <w:i w:val="0"/>
+          <w:color w:val="C08A2E"/>
+          <w:sz w:val="22"/>
+        </w:rPr>
+        <w:t>Reflection 1: Reflect (between Sessions 1 and 2, in your own time)</w:t>
+      </w:r>
+    </w:p>
+    <w:p>
+      <w:r>
+        <w:rPr>
+          <w:rFonts w:ascii="Aptos" w:hAnsi="Aptos"/>
+          <w:b w:val="0"/>
+          <w:i w:val="0"/>
+        </w:rPr>
+        <w:t>Each participant privately reviews what surfaced, and adds what they did not say out loud.</w:t>
+      </w:r>
+    </w:p>
+    <w:p>
+      <w:r>
+        <w:rPr>
+          <w:rFonts w:ascii="Aptos" w:hAnsi="Aptos"/>
+          <w:b/>
+          <w:i w:val="0"/>
+          <w:color w:val="095656"/>
+        </w:rPr>
+        <w:t xml:space="preserve">What you get: </w:t>
+      </w:r>
+      <w:r>
+        <w:rPr>
+          <w:rFonts w:ascii="Aptos" w:hAnsi="Aptos"/>
+          <w:b w:val="0"/>
+          <w:i w:val="0"/>
+        </w:rPr>
+        <w:t>The things people held back in the room, so the next session works with the whole picture and not only the loudest voices. [Confirm format and time.]</w:t>
+      </w:r>
+    </w:p>
+    <w:p>
+      <w:pPr>
+        <w:keepNext/>
+        <w:spacing w:before="160"/>
+      </w:pPr>
+      <w:r>
+        <w:rPr>
+          <w:rFonts w:ascii="Aptos" w:hAnsi="Aptos"/>
+          <w:b/>
+          <w:i w:val="0"/>
+          <w:color w:val="C08A2E"/>
+          <w:sz w:val="22"/>
+        </w:rPr>
+        <w:t>Session 2: Align</w:t>
+      </w:r>
+    </w:p>
+    <w:p>
+      <w:r>
+        <w:rPr>
+          <w:rFonts w:ascii="Aptos" w:hAnsi="Aptos"/>
+          <w:b w:val="0"/>
+          <w:i w:val="0"/>
+        </w:rPr>
+        <w:t>The team looks at what came out and finds where they already agree and where they do not. Differences are named instead of smoothed over.</w:t>
+      </w:r>
+    </w:p>
+    <w:p>
+      <w:r>
+        <w:rPr>
+          <w:rFonts w:ascii="Aptos" w:hAnsi="Aptos"/>
+          <w:b/>
+          <w:i w:val="0"/>
+          <w:color w:val="095656"/>
+        </w:rPr>
+        <w:t xml:space="preserve">What you get: </w:t>
+      </w:r>
+      <w:r>
+        <w:rPr>
+          <w:rFonts w:ascii="Aptos" w:hAnsi="Aptos"/>
+          <w:b w:val="0"/>
+          <w:i w:val="0"/>
+        </w:rPr>
+        <w:t>A clear view of where the team is aligned and where it is misaligned, with the reasons. [Add any artefact produced here.]</w:t>
+      </w:r>
+    </w:p>
+    <w:p>
+      <w:pPr>
+        <w:keepNext/>
+        <w:spacing w:before="160"/>
+      </w:pPr>
+      <w:r>
+        <w:rPr>
+          <w:rFonts w:ascii="Aptos" w:hAnsi="Aptos"/>
+          <w:b/>
+          <w:i w:val="0"/>
+          <w:color w:val="C08A2E"/>
+          <w:sz w:val="22"/>
+        </w:rPr>
+        <w:t>Reflection 2: Integrate (between Sessions 2 and 3, in your own time)</w:t>
+      </w:r>
+    </w:p>
+    <w:p>
+      <w:r>
+        <w:rPr>
+          <w:rFonts w:ascii="Aptos" w:hAnsi="Aptos"/>
+          <w:b w:val="0"/>
+          <w:i w:val="0"/>
+        </w:rPr>
+        <w:t>Each person considers what the alignment picture means for their own role and what they would want to happen next.</w:t>
+      </w:r>
+    </w:p>
+    <w:p>
+      <w:r>
+        <w:rPr>
+          <w:rFonts w:ascii="Aptos" w:hAnsi="Aptos"/>
+          <w:b/>
+          <w:i w:val="0"/>
+          <w:color w:val="095656"/>
+        </w:rPr>
+        <w:t xml:space="preserve">What you get: </w:t>
+      </w:r>
+      <w:r>
+        <w:rPr>
+          <w:rFonts w:ascii="Aptos" w:hAnsi="Aptos"/>
+          <w:b w:val="0"/>
+          <w:i w:val="0"/>
+        </w:rPr>
+        <w:t>Individual commitments and questions, ready to bring to the final session.</w:t>
+      </w:r>
+    </w:p>
+    <w:p>
+      <w:pPr>
+        <w:keepNext/>
+        <w:spacing w:before="160"/>
+      </w:pPr>
+      <w:r>
+        <w:rPr>
+          <w:rFonts w:ascii="Aptos" w:hAnsi="Aptos"/>
+          <w:b/>
+          <w:i w:val="0"/>
+          <w:color w:val="C08A2E"/>
+          <w:sz w:val="22"/>
+        </w:rPr>
+        <w:t>Session 3: Direct (Direct, Close)</w:t>
+      </w:r>
+    </w:p>
+    <w:p>
+      <w:r>
+        <w:rPr>
+          <w:rFonts w:ascii="Aptos" w:hAnsi="Aptos"/>
+          <w:b w:val="0"/>
+          <w:i w:val="0"/>
+        </w:rPr>
+        <w:t>The team turns what it has seen into direction: what to keep, what to look at, and what could be next. It closes with a clear view of the choices open to you. Honour™ does not prescribe solutions, so the direction belongs to the team.</w:t>
+      </w:r>
+    </w:p>
+    <w:p>
+      <w:r>
+        <w:rPr>
+          <w:rFonts w:ascii="Aptos" w:hAnsi="Aptos"/>
+          <w:b/>
+          <w:i w:val="0"/>
+          <w:color w:val="095656"/>
+        </w:rPr>
+        <w:t xml:space="preserve">What you get: </w:t>
+      </w:r>
+      <w:r>
+        <w:rPr>
+          <w:rFonts w:ascii="Aptos" w:hAnsi="Aptos"/>
+          <w:b w:val="0"/>
+          <w:i w:val="0"/>
+        </w:rPr>
+        <w:t>A shared set of next steps the team has chosen, and the sponsor's [summary or readout, format to be confirmed]. If further support helps, Flow™ is the natural next step.</w:t>
+      </w:r>
+    </w:p>
+    <w:p>
+      <w:pPr>
+        <w:keepNext/>
+        <w:spacing w:before="240"/>
+        <w:pBdr>
+          <w:bottom w:val="single" w:sz="8" w:space="1" w:color="C08A2E"/>
+        </w:pBdr>
+      </w:pPr>
+      <w:r>
+        <w:rPr>
+          <w:rFonts w:ascii="Aptos" w:hAnsi="Aptos"/>
+          <w:b/>
+          <w:i w:val="0"/>
+          <w:color w:val="095656"/>
+          <w:sz w:val="26"/>
+        </w:rPr>
+        <w:t>Questions to answer so this can become final copy</w:t>
+      </w:r>
+    </w:p>
+    <w:p>
+      <w:pPr>
+        <w:keepLines/>
+        <w:ind w:left="510" w:hanging="510"/>
+      </w:pPr>
+      <w:r>
+        <w:rPr>
+          <w:rFonts w:ascii="Aptos" w:hAnsi="Aptos"/>
+          <w:b w:val="0"/>
+          <w:i w:val="0"/>
+          <w:color w:val="095656"/>
+          <w:sz w:val="24"/>
+        </w:rPr>
+        <w:t xml:space="preserve">☐  </w:t>
+      </w:r>
+      <w:r>
+        <w:rPr>
+          <w:rFonts w:ascii="Aptos" w:hAnsi="Aptos"/>
+          <w:b w:val="0"/>
+          <w:i w:val="0"/>
+        </w:rPr>
+        <w:t>What does the sponsor receive at the end: a written report, a readout meeting, a one-page summary, or nothing beyond the sessions?</w:t>
+      </w:r>
+    </w:p>
+    <w:p>
+      <w:pPr>
+        <w:keepLines/>
+        <w:ind w:left="510" w:hanging="510"/>
+      </w:pPr>
+      <w:r>
+        <w:rPr>
+          <w:rFonts w:ascii="Aptos" w:hAnsi="Aptos"/>
+          <w:b w:val="0"/>
+          <w:i w:val="0"/>
+          <w:color w:val="095656"/>
+          <w:sz w:val="24"/>
+        </w:rPr>
+        <w:t xml:space="preserve">☐  </w:t>
+      </w:r>
+      <w:r>
+        <w:rPr>
+          <w:rFonts w:ascii="Aptos" w:hAnsi="Aptos"/>
+          <w:b w:val="0"/>
+          <w:i w:val="0"/>
+        </w:rPr>
+        <w:t>Do the sponsor and participants see the same results, or does the sponsor see a summary only?</w:t>
+      </w:r>
+    </w:p>
+    <w:p>
+      <w:pPr>
+        <w:keepLines/>
+        <w:ind w:left="510" w:hanging="510"/>
+      </w:pPr>
+      <w:r>
+        <w:rPr>
+          <w:rFonts w:ascii="Aptos" w:hAnsi="Aptos"/>
+          <w:b w:val="0"/>
+          <w:i w:val="0"/>
+          <w:color w:val="095656"/>
+          <w:sz w:val="24"/>
+        </w:rPr>
+        <w:t xml:space="preserve">☐  </w:t>
+      </w:r>
+      <w:r>
+        <w:rPr>
+          <w:rFonts w:ascii="Aptos" w:hAnsi="Aptos"/>
+          <w:b w:val="0"/>
+          <w:i w:val="0"/>
+        </w:rPr>
+        <w:t>Is the sponsor in the sessions, or do they stay out so people speak openly?</w:t>
+      </w:r>
+    </w:p>
+    <w:p>
+      <w:pPr>
+        <w:keepLines/>
+        <w:ind w:left="510" w:hanging="510"/>
+      </w:pPr>
+      <w:r>
+        <w:rPr>
+          <w:rFonts w:ascii="Aptos" w:hAnsi="Aptos"/>
+          <w:b w:val="0"/>
+          <w:i w:val="0"/>
+          <w:color w:val="095656"/>
+          <w:sz w:val="24"/>
+        </w:rPr>
+        <w:t xml:space="preserve">☐  </w:t>
+      </w:r>
+      <w:r>
+        <w:rPr>
+          <w:rFonts w:ascii="Aptos" w:hAnsi="Aptos"/>
+          <w:b w:val="0"/>
+          <w:i w:val="0"/>
+        </w:rPr>
+        <w:t>What do you do between sessions (analysis, preparing the next session)?</w:t>
+      </w:r>
+    </w:p>
+    <w:p>
+      <w:pPr>
+        <w:keepLines/>
+        <w:ind w:left="510" w:hanging="510"/>
+      </w:pPr>
+      <w:r>
+        <w:rPr>
+          <w:rFonts w:ascii="Aptos" w:hAnsi="Aptos"/>
+          <w:b w:val="0"/>
+          <w:i w:val="0"/>
+          <w:color w:val="095656"/>
+          <w:sz w:val="24"/>
+        </w:rPr>
+        <w:t xml:space="preserve">☐  </w:t>
+      </w:r>
+      <w:r>
+        <w:rPr>
+          <w:rFonts w:ascii="Aptos" w:hAnsi="Aptos"/>
+          <w:b w:val="0"/>
+          <w:i w:val="0"/>
+        </w:rPr>
+        <w:t>How long does each reflection take?</w:t>
       </w:r>
     </w:p>
     <w:sectPr>

</xml_diff>

<commit_message>
Update checklist and session copy using the Honour Brief
Co-Authored-By: Claude Sonnet 5.5 <noreply@anthropic.com>
Claude-Session: https://claude.ai/code/session_01VGNF22YqMhet38GotcC9rv
</commit_message>
<xml_diff>
--- a/qa/Website-Fix-and-Improve-List.docx
+++ b/qa/Website-Fix-and-Improve-List.docx
@@ -361,7 +361,7 @@
           <w:color w:val="C08A2E"/>
           <w:sz w:val="18"/>
         </w:rPr>
-        <w:t xml:space="preserve">[V] </w:t>
+        <w:t xml:space="preserve">[R] </w:t>
       </w:r>
       <w:r>
         <w:rPr>
@@ -369,7 +369,7 @@
           <w:b w:val="0"/>
           <w:i w:val="0"/>
         </w:rPr>
-        <w:t>Show the Honour™ fee, a range, or your founding-cohort price on the page, not only inside a PDF</w:t>
+        <w:t>Put the founding-cohort pricing from your Brief on the Honour™ page: from $441 per participant, $3,525 to $3,969 in total for 5 to 9 participants, 50% deposit and 50% on report delivery</w:t>
       </w:r>
       <w:r>
         <w:rPr>
@@ -379,7 +379,7 @@
           <w:color w:val="6B6B6B"/>
           <w:sz w:val="18"/>
         </w:rPr>
-        <w:t xml:space="preserve">  Homepage, Honour and Book Online all say only "Fee per participant".</w:t>
+        <w:t xml:space="preserve">  The Brief already has strong pricing. The website only says "Fee per participant", so the buyer never sees a number without downloading a PDF.</w:t>
       </w:r>
     </w:p>
     <w:p>
@@ -751,7 +751,7 @@
           <w:color w:val="C08A2E"/>
           <w:sz w:val="18"/>
         </w:rPr>
-        <w:t xml:space="preserve">[V] </w:t>
+        <w:t xml:space="preserve">[R] </w:t>
       </w:r>
       <w:r>
         <w:rPr>
@@ -759,7 +759,17 @@
           <w:b w:val="0"/>
           <w:i w:val="0"/>
         </w:rPr>
-        <w:t>Check the currency: the homepage shows "USD ($)" but the business is in South Africa. State which currency the fees are in</w:t>
+        <w:t>Say next to the fee that the base currency is USD, with GBP, EUR and ZAR available, so the \"USD ($)\" selector makes sense</w:t>
+      </w:r>
+      <w:r>
+        <w:rPr>
+          <w:rFonts w:ascii="Aptos" w:hAnsi="Aptos"/>
+          <w:b w:val="0"/>
+          <w:i/>
+          <w:color w:val="6B6B6B"/>
+          <w:sz w:val="18"/>
+        </w:rPr>
+        <w:t xml:space="preserve">  This is stated in the Brief but not on the site.</w:t>
       </w:r>
     </w:p>
     <w:p>
@@ -1075,7 +1085,7 @@
           <w:b w:val="0"/>
           <w:i w:val="0"/>
         </w:rPr>
-        <w:t>Add a sample deliverable to the Honour™ Brief: an "illustrative" findings page for a dummy team</w:t>
+        <w:t>Add an illustrative sample of the Honour™ Report and the individual participant report (dummy team, labelled \"illustrative\"), or at least a one-page outline of each</w:t>
       </w:r>
       <w:r>
         <w:rPr>
@@ -1085,7 +1095,7 @@
           <w:color w:val="6B6B6B"/>
           <w:sz w:val="18"/>
         </w:rPr>
-        <w:t xml:space="preserve">  This answers the buyer's main question: what do I get in my hand at the end?</w:t>
+        <w:t xml:space="preserve">  The Brief describes both reports but a buyer cannot see what one looks like.</w:t>
       </w:r>
     </w:p>
     <w:p>
@@ -1506,6 +1516,240 @@
           <w:sz w:val="18"/>
         </w:rPr>
         <w:t xml:space="preserve">  "We pace by breath, not urgency" needs a real example to feel credible to a sponsor.</w:t>
+      </w:r>
+    </w:p>
+    <w:p>
+      <w:pPr>
+        <w:keepLines/>
+        <w:ind w:left="510" w:hanging="510"/>
+      </w:pPr>
+      <w:r>
+        <w:rPr>
+          <w:rFonts w:ascii="Aptos" w:hAnsi="Aptos"/>
+          <w:b w:val="0"/>
+          <w:i w:val="0"/>
+          <w:color w:val="095656"/>
+          <w:sz w:val="24"/>
+        </w:rPr>
+        <w:t xml:space="preserve">☐  </w:t>
+      </w:r>
+      <w:r>
+        <w:rPr>
+          <w:rFonts w:ascii="Aptos" w:hAnsi="Aptos"/>
+          <w:b/>
+          <w:i w:val="0"/>
+          <w:color w:val="C08A2E"/>
+          <w:sz w:val="18"/>
+        </w:rPr>
+        <w:t xml:space="preserve">[R] </w:t>
+      </w:r>
+      <w:r>
+        <w:rPr>
+          <w:rFonts w:ascii="Aptos" w:hAnsi="Aptos"/>
+          <w:b w:val="0"/>
+          <w:i w:val="0"/>
+        </w:rPr>
+        <w:t>Put the Brief's step-by-step timeline (discovery call, intake, three sessions, report within 3 business days) on the Honour™ page</w:t>
+      </w:r>
+      <w:r>
+        <w:rPr>
+          <w:rFonts w:ascii="Aptos" w:hAnsi="Aptos"/>
+          <w:b w:val="0"/>
+          <w:i/>
+          <w:color w:val="6B6B6B"/>
+          <w:sz w:val="18"/>
+        </w:rPr>
+        <w:t xml:space="preserve">  It answers "how much of my time, and when?" better than anything on the site today.</w:t>
+      </w:r>
+    </w:p>
+    <w:p>
+      <w:pPr>
+        <w:keepLines/>
+        <w:ind w:left="510" w:hanging="510"/>
+      </w:pPr>
+      <w:r>
+        <w:rPr>
+          <w:rFonts w:ascii="Aptos" w:hAnsi="Aptos"/>
+          <w:b w:val="0"/>
+          <w:i w:val="0"/>
+          <w:color w:val="095656"/>
+          <w:sz w:val="24"/>
+        </w:rPr>
+        <w:t xml:space="preserve">☐  </w:t>
+      </w:r>
+      <w:r>
+        <w:rPr>
+          <w:rFonts w:ascii="Aptos" w:hAnsi="Aptos"/>
+          <w:b/>
+          <w:i w:val="0"/>
+          <w:color w:val="C08A2E"/>
+          <w:sz w:val="18"/>
+        </w:rPr>
+        <w:t xml:space="preserve">[V] </w:t>
+      </w:r>
+      <w:r>
+        <w:rPr>
+          <w:rFonts w:ascii="Aptos" w:hAnsi="Aptos"/>
+          <w:b w:val="0"/>
+          <w:i w:val="0"/>
+        </w:rPr>
+        <w:t>Show the minimum of 5 participants on the site (the Brief's pricing table starts at 5, the site only says a maximum of 9)</w:t>
+      </w:r>
+    </w:p>
+    <w:p>
+      <w:pPr>
+        <w:keepLines/>
+        <w:ind w:left="510" w:hanging="510"/>
+      </w:pPr>
+      <w:r>
+        <w:rPr>
+          <w:rFonts w:ascii="Aptos" w:hAnsi="Aptos"/>
+          <w:b w:val="0"/>
+          <w:i w:val="0"/>
+          <w:color w:val="095656"/>
+          <w:sz w:val="24"/>
+        </w:rPr>
+        <w:t xml:space="preserve">☐  </w:t>
+      </w:r>
+      <w:r>
+        <w:rPr>
+          <w:rFonts w:ascii="Aptos" w:hAnsi="Aptos"/>
+          <w:b/>
+          <w:i w:val="0"/>
+          <w:color w:val="C08A2E"/>
+          <w:sz w:val="18"/>
+        </w:rPr>
+        <w:t xml:space="preserve">[R] </w:t>
+      </w:r>
+      <w:r>
+        <w:rPr>
+          <w:rFonts w:ascii="Aptos" w:hAnsi="Aptos"/>
+          <w:b w:val="0"/>
+          <w:i w:val="0"/>
+        </w:rPr>
+        <w:t>Put the Gifts of Clarity (journaling eBooklet and Double Take Cards) on the Honour™ page as a visible benefit for each participant</w:t>
+      </w:r>
+    </w:p>
+    <w:p>
+      <w:pPr>
+        <w:keepLines/>
+        <w:ind w:left="510" w:hanging="510"/>
+      </w:pPr>
+      <w:r>
+        <w:rPr>
+          <w:rFonts w:ascii="Aptos" w:hAnsi="Aptos"/>
+          <w:b w:val="0"/>
+          <w:i w:val="0"/>
+          <w:color w:val="095656"/>
+          <w:sz w:val="24"/>
+        </w:rPr>
+        <w:t xml:space="preserve">☐  </w:t>
+      </w:r>
+      <w:r>
+        <w:rPr>
+          <w:rFonts w:ascii="Aptos" w:hAnsi="Aptos"/>
+          <w:b/>
+          <w:i w:val="0"/>
+          <w:color w:val="C08A2E"/>
+          <w:sz w:val="18"/>
+        </w:rPr>
+        <w:t xml:space="preserve">[R] </w:t>
+      </w:r>
+      <w:r>
+        <w:rPr>
+          <w:rFonts w:ascii="Aptos" w:hAnsi="Aptos"/>
+          <w:b w:val="0"/>
+          <w:i w:val="0"/>
+        </w:rPr>
+        <w:t>Add the POPIA and GDPR data-handling line to the Honour™ page, not just the Brief</w:t>
+      </w:r>
+      <w:r>
+        <w:rPr>
+          <w:rFonts w:ascii="Aptos" w:hAnsi="Aptos"/>
+          <w:b w:val="0"/>
+          <w:i/>
+          <w:color w:val="6B6B6B"/>
+          <w:sz w:val="18"/>
+        </w:rPr>
+        <w:t xml:space="preserve">  Confidentiality is a sponsor's first worry about a team diagnostic.</w:t>
+      </w:r>
+    </w:p>
+    <w:p>
+      <w:pPr>
+        <w:keepLines/>
+        <w:ind w:left="510" w:hanging="510"/>
+      </w:pPr>
+      <w:r>
+        <w:rPr>
+          <w:rFonts w:ascii="Aptos" w:hAnsi="Aptos"/>
+          <w:b w:val="0"/>
+          <w:i w:val="0"/>
+          <w:color w:val="095656"/>
+          <w:sz w:val="24"/>
+        </w:rPr>
+        <w:t xml:space="preserve">☐  </w:t>
+      </w:r>
+      <w:r>
+        <w:rPr>
+          <w:rFonts w:ascii="Aptos" w:hAnsi="Aptos"/>
+          <w:b/>
+          <w:i w:val="0"/>
+          <w:color w:val="C08A2E"/>
+          <w:sz w:val="18"/>
+        </w:rPr>
+        <w:t xml:space="preserve">[R] </w:t>
+      </w:r>
+      <w:r>
+        <w:rPr>
+          <w:rFonts w:ascii="Aptos" w:hAnsi="Aptos"/>
+          <w:b w:val="0"/>
+          <w:i w:val="0"/>
+        </w:rPr>
+        <w:t>Decide whether Honour™ gives recommendations. The Brief says "actionable" and "before making recommendations" but also "does not prescribe"</w:t>
+      </w:r>
+      <w:r>
+        <w:rPr>
+          <w:rFonts w:ascii="Aptos" w:hAnsi="Aptos"/>
+          <w:b w:val="0"/>
+          <w:i/>
+          <w:color w:val="6B6B6B"/>
+          <w:sz w:val="18"/>
+        </w:rPr>
+        <w:t xml:space="preserve">  One wording everywhere.</w:t>
+      </w:r>
+    </w:p>
+    <w:p>
+      <w:pPr>
+        <w:keepLines/>
+        <w:ind w:left="510" w:hanging="510"/>
+      </w:pPr>
+      <w:r>
+        <w:rPr>
+          <w:rFonts w:ascii="Aptos" w:hAnsi="Aptos"/>
+          <w:b w:val="0"/>
+          <w:i w:val="0"/>
+          <w:color w:val="095656"/>
+          <w:sz w:val="24"/>
+        </w:rPr>
+        <w:t xml:space="preserve">☐  </w:t>
+      </w:r>
+      <w:r>
+        <w:rPr>
+          <w:rFonts w:ascii="Aptos" w:hAnsi="Aptos"/>
+          <w:b/>
+          <w:i w:val="0"/>
+          <w:color w:val="C08A2E"/>
+          <w:sz w:val="18"/>
+        </w:rPr>
+        <w:t xml:space="preserve">[R] </w:t>
+      </w:r>
+      <w:r>
+        <w:rPr>
+          <w:rFonts w:ascii="Aptos" w:hAnsi="Aptos"/>
+          <w:b w:val="0"/>
+          <w:i w:val="0"/>
+        </w:rPr>
+        <w:t>Say whether the sponsor attends the sessions</w:t>
       </w:r>
     </w:p>
     <w:p>
@@ -3266,7 +3510,7 @@
           <w:color w:val="6B6B6B"/>
           <w:sz w:val="18"/>
         </w:rPr>
-        <w:t>Draft for your review. Text in [square brackets] is a placeholder. The mapping of the 8 steps to sessions is an assumption to correct.</w:t>
+        <w:t>Built from your Honour™ Brief. Text in [square brackets] needs your decision. Written to be lifted straight onto the Honour™ page.</w:t>
       </w:r>
     </w:p>
     <w:p>
@@ -3292,7 +3536,7 @@
           <w:b w:val="0"/>
           <w:i w:val="0"/>
         </w:rPr>
-        <w:t>Honour™ runs over two weeks: three 90-minute online sessions and two short reflections you complete in your own time. Up to nine people take part. It does not fix or prescribe. It shows you what is happening so you can decide what to do next.</w:t>
+        <w:t>Honour™ runs over two weeks: three 90-minute online sessions and two short private reflections. Between three and nine people take part [the Brief says 5 to 9 in the pricing table, so confirm the minimum]. Honour™ does not fix or prescribe. It shows you what is really happening, so you can decide what to do next.</w:t>
       </w:r>
     </w:p>
     <w:p>
@@ -3308,7 +3552,7 @@
           <w:color w:val="C08A2E"/>
           <w:sz w:val="22"/>
         </w:rPr>
-        <w:t>Session 1: Reveal (Enter, Orient, Reveal)</w:t>
+        <w:t>Before Session 1: Intake</w:t>
       </w:r>
     </w:p>
     <w:p>
@@ -3318,7 +3562,7 @@
           <w:b w:val="0"/>
           <w:i w:val="0"/>
         </w:rPr>
-        <w:t>The team gets into the room and agrees how the work will run. Then each person is asked, in a structured way, what is happening in the team beyond the meeting narratives: how work really gets done, where it stalls and where people see things differently.</w:t>
+        <w:t>You complete a short sponsor intake and consent form, and each participant completes an individual experience form. Data is handled in line with POPIA and equivalent international standards, including GDPR.</w:t>
       </w:r>
     </w:p>
     <w:p>
@@ -3337,7 +3581,7 @@
           <w:b w:val="0"/>
           <w:i w:val="0"/>
         </w:rPr>
-        <w:t>A first honest picture of the team, in its own words, and a shared starting point that nobody has had to argue for. [Add anything handed to the sponsor after this session.]</w:t>
+        <w:t>Every session starts with the full picture already in hand, and everyone knows how their information is used.</w:t>
       </w:r>
     </w:p>
     <w:p>
@@ -3353,7 +3597,7 @@
           <w:color w:val="C08A2E"/>
           <w:sz w:val="22"/>
         </w:rPr>
-        <w:t>Reflection 1: Reflect (between Sessions 1 and 2, in your own time)</w:t>
+        <w:t>Session 1: Reveal (90 minutes, online, live)</w:t>
       </w:r>
     </w:p>
     <w:p>
@@ -3363,7 +3607,7 @@
           <w:b w:val="0"/>
           <w:i w:val="0"/>
         </w:rPr>
-        <w:t>Each participant privately reviews what surfaced, and adds what they did not say out loud.</w:t>
+        <w:t>The first structured session surfaces current patterns, sources of friction and the concerns nobody says out loud in meetings.</w:t>
       </w:r>
     </w:p>
     <w:p>
@@ -3382,7 +3626,7 @@
           <w:b w:val="0"/>
           <w:i w:val="0"/>
         </w:rPr>
-        <w:t>The things people held back in the room, so the next session works with the whole picture and not only the loudest voices. [Confirm format and time.]</w:t>
+        <w:t>A first honest picture of how the team really works, in the team's own words.</w:t>
       </w:r>
     </w:p>
     <w:p>
@@ -3398,7 +3642,7 @@
           <w:color w:val="C08A2E"/>
           <w:sz w:val="22"/>
         </w:rPr>
-        <w:t>Session 2: Align</w:t>
+        <w:t>Reflect (a few days after Session 1, private)</w:t>
       </w:r>
     </w:p>
     <w:p>
@@ -3408,7 +3652,7 @@
           <w:b w:val="0"/>
           <w:i w:val="0"/>
         </w:rPr>
-        <w:t>The team looks at what came out and finds where they already agree and where they do not. Differences are named instead of smoothed over.</w:t>
+        <w:t>Each participant receives a brief private reflection to record what emerged for them. While they do, the session data is synthesised and anonymised. [Say how long it takes, for example about 20 minutes.]</w:t>
       </w:r>
     </w:p>
     <w:p>
@@ -3427,7 +3671,7 @@
           <w:b w:val="0"/>
           <w:i w:val="0"/>
         </w:rPr>
-        <w:t>A clear view of where the team is aligned and where it is misaligned, with the reasons. [Add any artefact produced here.]</w:t>
+        <w:t>A safe place to say what did not come out in the room, so the next session works with the whole picture.</w:t>
       </w:r>
     </w:p>
     <w:p>
@@ -3443,7 +3687,7 @@
           <w:color w:val="C08A2E"/>
           <w:sz w:val="22"/>
         </w:rPr>
-        <w:t>Reflection 2: Integrate (between Sessions 2 and 3, in your own time)</w:t>
+        <w:t>Session 2: Align (90 minutes, online, live)</w:t>
       </w:r>
     </w:p>
     <w:p>
@@ -3453,7 +3697,7 @@
           <w:b w:val="0"/>
           <w:i w:val="0"/>
         </w:rPr>
-        <w:t>Each person considers what the alignment picture means for their own role and what they would want to happen next.</w:t>
+        <w:t>The team reviews the anonymised diagnostic data together and maps where the misalignment sits: in roles, communication, systems, leadership or the work itself.</w:t>
       </w:r>
     </w:p>
     <w:p>
@@ -3472,7 +3716,7 @@
           <w:b w:val="0"/>
           <w:i w:val="0"/>
         </w:rPr>
-        <w:t>Individual commitments and questions, ready to bring to the final session.</w:t>
+        <w:t>A clear map of where the team is aligned and where it is not, with the reasons.</w:t>
       </w:r>
     </w:p>
     <w:p>
@@ -3488,7 +3732,7 @@
           <w:color w:val="C08A2E"/>
           <w:sz w:val="22"/>
         </w:rPr>
-        <w:t>Session 3: Direct (Direct, Close)</w:t>
+        <w:t>Integrate (after Session 2, private)</w:t>
       </w:r>
     </w:p>
     <w:p>
@@ -3498,7 +3742,7 @@
           <w:b w:val="0"/>
           <w:i w:val="0"/>
         </w:rPr>
-        <w:t>The team turns what it has seen into direction: what to keep, what to look at, and what could be next. It closes with a clear view of the choices open to you. Honour™ does not prescribe solutions, so the direction belongs to the team.</w:t>
+        <w:t>A second brief reflection invites each participant to bring what was aligned into their own context, while the directional synthesis is prepared for the final session.</w:t>
       </w:r>
     </w:p>
     <w:p>
@@ -3517,7 +3761,97 @@
           <w:b w:val="0"/>
           <w:i w:val="0"/>
         </w:rPr>
-        <w:t>A shared set of next steps the team has chosen, and the sponsor's [summary or readout, format to be confirmed]. If further support helps, Flow™ is the natural next step.</w:t>
+        <w:t>Each person's own view of what the findings mean for their role.</w:t>
+      </w:r>
+    </w:p>
+    <w:p>
+      <w:pPr>
+        <w:keepNext/>
+        <w:spacing w:before="160"/>
+      </w:pPr>
+      <w:r>
+        <w:rPr>
+          <w:rFonts w:ascii="Aptos" w:hAnsi="Aptos"/>
+          <w:b/>
+          <w:i w:val="0"/>
+          <w:color w:val="C08A2E"/>
+          <w:sz w:val="22"/>
+        </w:rPr>
+        <w:t>Session 3: Direct (90 minutes, online, live)</w:t>
+      </w:r>
+    </w:p>
+    <w:p>
+      <w:r>
+        <w:rPr>
+          <w:rFonts w:ascii="Aptos" w:hAnsi="Aptos"/>
+          <w:b w:val="0"/>
+          <w:i w:val="0"/>
+        </w:rPr>
+        <w:t>The final session consolidates the findings, tests assumptions and confirms the overall picture. This is where truth becomes direction. The next steps remain yours to decide.</w:t>
+      </w:r>
+    </w:p>
+    <w:p>
+      <w:r>
+        <w:rPr>
+          <w:rFonts w:ascii="Aptos" w:hAnsi="Aptos"/>
+          <w:b/>
+          <w:i w:val="0"/>
+          <w:color w:val="095656"/>
+        </w:rPr>
+        <w:t xml:space="preserve">What you get: </w:t>
+      </w:r>
+      <w:r>
+        <w:rPr>
+          <w:rFonts w:ascii="Aptos" w:hAnsi="Aptos"/>
+          <w:b w:val="0"/>
+          <w:i w:val="0"/>
+        </w:rPr>
+        <w:t>A confirmed, shared picture of your team that leadership can act on.</w:t>
+      </w:r>
+    </w:p>
+    <w:p>
+      <w:pPr>
+        <w:keepNext/>
+        <w:spacing w:before="160"/>
+      </w:pPr>
+      <w:r>
+        <w:rPr>
+          <w:rFonts w:ascii="Aptos" w:hAnsi="Aptos"/>
+          <w:b/>
+          <w:i w:val="0"/>
+          <w:color w:val="C08A2E"/>
+          <w:sz w:val="22"/>
+        </w:rPr>
+        <w:t>Within 3 business days: The Honour™ Report</w:t>
+      </w:r>
+    </w:p>
+    <w:p>
+      <w:r>
+        <w:rPr>
+          <w:rFonts w:ascii="Aptos" w:hAnsi="Aptos"/>
+          <w:b w:val="0"/>
+          <w:i w:val="0"/>
+        </w:rPr>
+        <w:t>The sponsor receives the organisational diagnostic report, with all data anonymised. Each participant receives an individual insight report based on their own responses. Every participant also receives the Gifts of Clarity: a journaling prompts eBooklet and the Double Take Cards (I Do Know vs I Don't Know) reflection deck.</w:t>
+      </w:r>
+    </w:p>
+    <w:p>
+      <w:r>
+        <w:rPr>
+          <w:rFonts w:ascii="Aptos" w:hAnsi="Aptos"/>
+          <w:b/>
+          <w:i w:val="0"/>
+          <w:color w:val="095656"/>
+        </w:rPr>
+        <w:t xml:space="preserve">What you get: </w:t>
+      </w:r>
+      <w:r>
+        <w:rPr>
+          <w:rFonts w:ascii="Aptos" w:hAnsi="Aptos"/>
+          <w:b w:val="0"/>
+          <w:i w:val="0"/>
+        </w:rPr>
+        <w:t>A report for the sponsor, a personal report for each participant, and a lasting reflection tool for each person, all included in one per-participant rate.</w:t>
       </w:r>
     </w:p>
     <w:p>
@@ -3536,7 +3870,7 @@
           <w:color w:val="095656"/>
           <w:sz w:val="26"/>
         </w:rPr>
-        <w:t>Questions to answer so this can become final copy</w:t>
+        <w:t>What the Brief already answers, and what is still open</w:t>
       </w:r>
     </w:p>
     <w:p>
@@ -3560,7 +3894,7 @@
           <w:b w:val="0"/>
           <w:i w:val="0"/>
         </w:rPr>
-        <w:t>What does the sponsor receive at the end: a written report, a readout meeting, a one-page summary, or nothing beyond the sessions?</w:t>
+        <w:t>Answered: the sponsor receives the anonymised Honour™ Report within 3 business days, and participants receive their own reports</w:t>
       </w:r>
     </w:p>
     <w:p>
@@ -3584,7 +3918,7 @@
           <w:b w:val="0"/>
           <w:i w:val="0"/>
         </w:rPr>
-        <w:t>Do the sponsor and participants see the same results, or does the sponsor see a summary only?</w:t>
+        <w:t>Answered: pricing is $441 to $705 per participant (5 to 9 people), 50% deposit and 50% on report delivery, USD base with GBP, EUR and ZAR available</w:t>
       </w:r>
     </w:p>
     <w:p>
@@ -3608,7 +3942,7 @@
           <w:b w:val="0"/>
           <w:i w:val="0"/>
         </w:rPr>
-        <w:t>Is the sponsor in the sessions, or do they stay out so people speak openly?</w:t>
+        <w:t>Still open: does the sponsor attend the sessions, or stay out so people speak freely? Say so in the Brief and on the site</w:t>
       </w:r>
     </w:p>
     <w:p>
@@ -3632,7 +3966,7 @@
           <w:b w:val="0"/>
           <w:i w:val="0"/>
         </w:rPr>
-        <w:t>What do you do between sessions (analysis, preparing the next session)?</w:t>
+        <w:t>Still open: how long does each reflection take?</w:t>
       </w:r>
     </w:p>
     <w:p>
@@ -3656,7 +3990,55 @@
           <w:b w:val="0"/>
           <w:i w:val="0"/>
         </w:rPr>
-        <w:t>How long does each reflection take?</w:t>
+        <w:t>Still open: the minimum team size. The pricing table starts at 5 participants but the website only states a maximum of 9</w:t>
+      </w:r>
+    </w:p>
+    <w:p>
+      <w:pPr>
+        <w:keepLines/>
+        <w:ind w:left="510" w:hanging="510"/>
+      </w:pPr>
+      <w:r>
+        <w:rPr>
+          <w:rFonts w:ascii="Aptos" w:hAnsi="Aptos"/>
+          <w:b w:val="0"/>
+          <w:i w:val="0"/>
+          <w:color w:val="095656"/>
+          <w:sz w:val="24"/>
+        </w:rPr>
+        <w:t xml:space="preserve">☐  </w:t>
+      </w:r>
+      <w:r>
+        <w:rPr>
+          <w:rFonts w:ascii="Aptos" w:hAnsi="Aptos"/>
+          <w:b w:val="0"/>
+          <w:i w:val="0"/>
+        </w:rPr>
+        <w:t>Still open: the Brief says the findings are "clear and actionable" and that Align happens "before making recommendations", but elsewhere says Honour™ does not prescribe. Decide whether you give recommendations, and use one wording everywhere</w:t>
+      </w:r>
+    </w:p>
+    <w:p>
+      <w:pPr>
+        <w:keepLines/>
+        <w:ind w:left="510" w:hanging="510"/>
+      </w:pPr>
+      <w:r>
+        <w:rPr>
+          <w:rFonts w:ascii="Aptos" w:hAnsi="Aptos"/>
+          <w:b w:val="0"/>
+          <w:i w:val="0"/>
+          <w:color w:val="095656"/>
+          <w:sz w:val="24"/>
+        </w:rPr>
+        <w:t xml:space="preserve">☐  </w:t>
+      </w:r>
+      <w:r>
+        <w:rPr>
+          <w:rFonts w:ascii="Aptos" w:hAnsi="Aptos"/>
+          <w:b w:val="0"/>
+          <w:i w:val="0"/>
+        </w:rPr>
+        <w:t>Still open: Session 2 is labelled "Week 1–2" in the timeline. Give the exact spacing (for example, Session 1 on day 1, Session 2 on day 6, Session 3 on day 12)</w:t>
       </w:r>
     </w:p>
     <w:sectPr>

</xml_diff>

<commit_message>
Update checklist and session copy with confirmed process details
Co-Authored-By: Claude Sonnet 5.5 <noreply@anthropic.com>
Claude-Session: https://claude.ai/code/session_01VGNF22YqMhet38GotcC9rv
</commit_message>
<xml_diff>
--- a/qa/Website-Fix-and-Improve-List.docx
+++ b/qa/Website-Fix-and-Improve-List.docx
@@ -1593,7 +1593,7 @@
           <w:b w:val="0"/>
           <w:i w:val="0"/>
         </w:rPr>
-        <w:t>Show the minimum of 5 participants on the site (the Brief's pricing table starts at 5, the site only says a maximum of 9)</w:t>
+        <w:t>Show \"5 to 9 participants\" on the Honour™ page and Book Online (the site currently only says a maximum of 9)</w:t>
       </w:r>
     </w:p>
     <w:p>
@@ -1705,7 +1705,7 @@
           <w:b w:val="0"/>
           <w:i w:val="0"/>
         </w:rPr>
-        <w:t>Decide whether Honour™ gives recommendations. The Brief says "actionable" and "before making recommendations" but also "does not prescribe"</w:t>
+        <w:t>Update the \"does not fix or prescribe\" wording on the site and in the Brief, because Honour™ does give recommendations</w:t>
       </w:r>
       <w:r>
         <w:rPr>
@@ -1715,7 +1715,7 @@
           <w:color w:val="6B6B6B"/>
           <w:sz w:val="18"/>
         </w:rPr>
-        <w:t xml:space="preserve">  One wording everywhere.</w:t>
+        <w:t xml:space="preserve">  Suggested: "Honour™ recommends. It does not implement."</w:t>
       </w:r>
     </w:p>
     <w:p>
@@ -1749,7 +1749,109 @@
           <w:b w:val="0"/>
           <w:i w:val="0"/>
         </w:rPr>
-        <w:t>Say whether the sponsor attends the sessions</w:t>
+        <w:t>State on the site and in the Brief that the sponsor attends only if the participants agree</w:t>
+      </w:r>
+    </w:p>
+    <w:p>
+      <w:pPr>
+        <w:keepLines/>
+        <w:ind w:left="510" w:hanging="510"/>
+      </w:pPr>
+      <w:r>
+        <w:rPr>
+          <w:rFonts w:ascii="Aptos" w:hAnsi="Aptos"/>
+          <w:b w:val="0"/>
+          <w:i w:val="0"/>
+          <w:color w:val="095656"/>
+          <w:sz w:val="24"/>
+        </w:rPr>
+        <w:t xml:space="preserve">☐  </w:t>
+      </w:r>
+      <w:r>
+        <w:rPr>
+          <w:rFonts w:ascii="Aptos" w:hAnsi="Aptos"/>
+          <w:b/>
+          <w:i w:val="0"/>
+          <w:color w:val="C08A2E"/>
+          <w:sz w:val="18"/>
+        </w:rPr>
+        <w:t xml:space="preserve">[V] </w:t>
+      </w:r>
+      <w:r>
+        <w:rPr>
+          <w:rFonts w:ascii="Aptos" w:hAnsi="Aptos"/>
+          <w:b w:val="0"/>
+          <w:i w:val="0"/>
+        </w:rPr>
+        <w:t>Change report delivery from 3 to 5 business days everywhere: Brief (Sections Four, Five, Six), Honour™ page, booking descriptions, policies</w:t>
+      </w:r>
+    </w:p>
+    <w:p>
+      <w:pPr>
+        <w:keepLines/>
+        <w:ind w:left="510" w:hanging="510"/>
+      </w:pPr>
+      <w:r>
+        <w:rPr>
+          <w:rFonts w:ascii="Aptos" w:hAnsi="Aptos"/>
+          <w:b w:val="0"/>
+          <w:i w:val="0"/>
+          <w:color w:val="095656"/>
+          <w:sz w:val="24"/>
+        </w:rPr>
+        <w:t xml:space="preserve">☐  </w:t>
+      </w:r>
+      <w:r>
+        <w:rPr>
+          <w:rFonts w:ascii="Aptos" w:hAnsi="Aptos"/>
+          <w:b/>
+          <w:i w:val="0"/>
+          <w:color w:val="C08A2E"/>
+          <w:sz w:val="18"/>
+        </w:rPr>
+        <w:t xml:space="preserve">[R] </w:t>
+      </w:r>
+      <w:r>
+        <w:rPr>
+          <w:rFonts w:ascii="Aptos" w:hAnsi="Aptos"/>
+          <w:b w:val="0"/>
+          <w:i w:val="0"/>
+        </w:rPr>
+        <w:t>Show the real session pattern on the Honour™ page: Tuesday, Friday, then the following Wednesday, with the reflection emails after Sessions 1 and 2</w:t>
+      </w:r>
+    </w:p>
+    <w:p>
+      <w:pPr>
+        <w:keepLines/>
+        <w:ind w:left="510" w:hanging="510"/>
+      </w:pPr>
+      <w:r>
+        <w:rPr>
+          <w:rFonts w:ascii="Aptos" w:hAnsi="Aptos"/>
+          <w:b w:val="0"/>
+          <w:i w:val="0"/>
+          <w:color w:val="095656"/>
+          <w:sz w:val="24"/>
+        </w:rPr>
+        <w:t xml:space="preserve">☐  </w:t>
+      </w:r>
+      <w:r>
+        <w:rPr>
+          <w:rFonts w:ascii="Aptos" w:hAnsi="Aptos"/>
+          <w:b/>
+          <w:i w:val="0"/>
+          <w:color w:val="C08A2E"/>
+          <w:sz w:val="18"/>
+        </w:rPr>
+        <w:t xml:space="preserve">[T] </w:t>
+      </w:r>
+      <w:r>
+        <w:rPr>
+          <w:rFonts w:ascii="Aptos" w:hAnsi="Aptos"/>
+          <w:b w:val="0"/>
+          <w:i w:val="0"/>
+        </w:rPr>
+        <w:t>Test the Tally reflection and Integrate questionnaires: link works on phone, submissions arrive, confirmation shown, wording matches the Brief</w:t>
       </w:r>
     </w:p>
     <w:p>
@@ -3510,7 +3612,7 @@
           <w:color w:val="6B6B6B"/>
           <w:sz w:val="18"/>
         </w:rPr>
-        <w:t>Built from your Honour™ Brief. Text in [square brackets] needs your decision. Written to be lifted straight onto the Honour™ page.</w:t>
+        <w:t>Built from your Honour™ Brief and your answers. Text in [square brackets] needs your decision. Written to be lifted onto the Honour™ page.</w:t>
       </w:r>
     </w:p>
     <w:p>
@@ -3536,7 +3638,7 @@
           <w:b w:val="0"/>
           <w:i w:val="0"/>
         </w:rPr>
-        <w:t>Honour™ runs over two weeks: three 90-minute online sessions and two short private reflections. Between three and nine people take part [the Brief says 5 to 9 in the pricing table, so confirm the minimum]. Honour™ does not fix or prescribe. It shows you what is really happening, so you can decide what to do next.</w:t>
+        <w:t>Honour™ runs over about a week and a half: three 90-minute online sessions on a Tuesday, a Friday and the following Wednesday, with a short private reflection after each of the first two. Between five and nine people take part. Honour™ shows you what is really happening and gives you clear recommendations, so you can decide what to do next.</w:t>
       </w:r>
     </w:p>
     <w:p>
@@ -3562,7 +3664,7 @@
           <w:b w:val="0"/>
           <w:i w:val="0"/>
         </w:rPr>
-        <w:t>You complete a short sponsor intake and consent form, and each participant completes an individual experience form. Data is handled in line with POPIA and equivalent international standards, including GDPR.</w:t>
+        <w:t>The sponsor completes an intake and consent form, and each participant completes an individual experience form. Data is handled in line with POPIA and equivalent international standards, including GDPR.</w:t>
       </w:r>
     </w:p>
     <w:p>
@@ -3597,7 +3699,7 @@
           <w:color w:val="C08A2E"/>
           <w:sz w:val="22"/>
         </w:rPr>
-        <w:t>Session 1: Reveal (90 minutes, online, live)</w:t>
+        <w:t>Session 1, Tuesday: Reveal (90 minutes, online, live)</w:t>
       </w:r>
     </w:p>
     <w:p>
@@ -3642,7 +3744,7 @@
           <w:color w:val="C08A2E"/>
           <w:sz w:val="22"/>
         </w:rPr>
-        <w:t>Reflect (a few days after Session 1, private)</w:t>
+        <w:t>After Session 1: Reflect (private, by email link)</w:t>
       </w:r>
     </w:p>
     <w:p>
@@ -3652,7 +3754,7 @@
           <w:b w:val="0"/>
           <w:i w:val="0"/>
         </w:rPr>
-        <w:t>Each participant receives a brief private reflection to record what emerged for them. While they do, the session data is synthesised and anonymised. [Say how long it takes, for example about 20 minutes.]</w:t>
+        <w:t>Straight after Session 1, each participant receives an email with a link to a short private reflection questionnaire. While they complete it, the session data is synthesised and anonymised. [Say how long it takes, for example about 15 to 20 minutes.]</w:t>
       </w:r>
     </w:p>
     <w:p>
@@ -3687,7 +3789,7 @@
           <w:color w:val="C08A2E"/>
           <w:sz w:val="22"/>
         </w:rPr>
-        <w:t>Session 2: Align (90 minutes, online, live)</w:t>
+        <w:t>Session 2, Friday: Align (90 minutes, online, live)</w:t>
       </w:r>
     </w:p>
     <w:p>
@@ -3732,7 +3834,7 @@
           <w:color w:val="C08A2E"/>
           <w:sz w:val="22"/>
         </w:rPr>
-        <w:t>Integrate (after Session 2, private)</w:t>
+        <w:t>After Session 2: Integrate (private, by email link)</w:t>
       </w:r>
     </w:p>
     <w:p>
@@ -3742,7 +3844,7 @@
           <w:b w:val="0"/>
           <w:i w:val="0"/>
         </w:rPr>
-        <w:t>A second brief reflection invites each participant to bring what was aligned into their own context, while the directional synthesis is prepared for the final session.</w:t>
+        <w:t>Straight after Session 2, each participant receives an email with a link to a second short private questionnaire, to bring what was aligned into their own context. Meanwhile the directional synthesis is prepared for the final session. [Say how long it takes.]</w:t>
       </w:r>
     </w:p>
     <w:p>
@@ -3777,7 +3879,7 @@
           <w:color w:val="C08A2E"/>
           <w:sz w:val="22"/>
         </w:rPr>
-        <w:t>Session 3: Direct (90 minutes, online, live)</w:t>
+        <w:t>Session 3, the following Wednesday: Direct (90 minutes, online, live)</w:t>
       </w:r>
     </w:p>
     <w:p>
@@ -3787,7 +3889,7 @@
           <w:b w:val="0"/>
           <w:i w:val="0"/>
         </w:rPr>
-        <w:t>The final session consolidates the findings, tests assumptions and confirms the overall picture. This is where truth becomes direction. The next steps remain yours to decide.</w:t>
+        <w:t>The final session consolidates the findings, tests assumptions and confirms the overall picture. This is where truth becomes direction, and where the recommendations are shared.</w:t>
       </w:r>
     </w:p>
     <w:p>
@@ -3806,7 +3908,7 @@
           <w:b w:val="0"/>
           <w:i w:val="0"/>
         </w:rPr>
-        <w:t>A confirmed, shared picture of your team that leadership can act on.</w:t>
+        <w:t>A confirmed, shared picture of your team, with recommendations leadership can act on.</w:t>
       </w:r>
     </w:p>
     <w:p>
@@ -3822,7 +3924,7 @@
           <w:color w:val="C08A2E"/>
           <w:sz w:val="22"/>
         </w:rPr>
-        <w:t>Within 3 business days: The Honour™ Report</w:t>
+        <w:t>Within 5 business days: The Honour™ Report</w:t>
       </w:r>
     </w:p>
     <w:p>
@@ -3852,6 +3954,32 @@
           <w:i w:val="0"/>
         </w:rPr>
         <w:t>A report for the sponsor, a personal report for each participant, and a lasting reflection tool for each person, all included in one per-participant rate.</w:t>
+      </w:r>
+    </w:p>
+    <w:p>
+      <w:pPr>
+        <w:keepNext/>
+        <w:spacing w:before="160"/>
+      </w:pPr>
+      <w:r>
+        <w:rPr>
+          <w:rFonts w:ascii="Aptos" w:hAnsi="Aptos"/>
+          <w:b/>
+          <w:i w:val="0"/>
+          <w:color w:val="C08A2E"/>
+          <w:sz w:val="22"/>
+        </w:rPr>
+        <w:t>Who attends</w:t>
+      </w:r>
+    </w:p>
+    <w:p>
+      <w:r>
+        <w:rPr>
+          <w:rFonts w:ascii="Aptos" w:hAnsi="Aptos"/>
+          <w:b w:val="0"/>
+          <w:i w:val="0"/>
+        </w:rPr>
+        <w:t>Participants are the team members taking part. The sponsor joins the sessions only if the participants agree to it, so people can speak freely.</w:t>
       </w:r>
     </w:p>
     <w:p>
@@ -3870,7 +3998,7 @@
           <w:color w:val="095656"/>
           <w:sz w:val="26"/>
         </w:rPr>
-        <w:t>What the Brief already answers, and what is still open</w:t>
+        <w:t>Wording to update everywhere</w:t>
       </w:r>
     </w:p>
     <w:p>
@@ -3894,7 +4022,7 @@
           <w:b w:val="0"/>
           <w:i w:val="0"/>
         </w:rPr>
-        <w:t>Answered: the sponsor receives the anonymised Honour™ Report within 3 business days, and participants receive their own reports</w:t>
+        <w:t>Report delivery is now within 5 business days. The Brief still says 3 business days in Sections Four, Five and Six. Update the Brief, the Honour™ page, the booking descriptions and the policy pages</w:t>
       </w:r>
     </w:p>
     <w:p>
@@ -3918,7 +4046,7 @@
           <w:b w:val="0"/>
           <w:i w:val="0"/>
         </w:rPr>
-        <w:t>Answered: pricing is $441 to $705 per participant (5 to 9 people), 50% deposit and 50% on report delivery, USD base with GBP, EUR and ZAR available</w:t>
+        <w:t>The Brief says the reflection is sent "a few days after Session 1". Your process sends the email straight after the session. Update the Brief</w:t>
       </w:r>
     </w:p>
     <w:p>
@@ -3942,7 +4070,7 @@
           <w:b w:val="0"/>
           <w:i w:val="0"/>
         </w:rPr>
-        <w:t>Still open: does the sponsor attend the sessions, or stay out so people speak freely? Say so in the Brief and on the site</w:t>
+        <w:t>Recommendations are included, so update lines that say Honour™ "does not fix or prescribe" and "does not provide answers". A suggested wording: "Honour™ recommends. It does not implement." The X-ray comparison still works, but say a doctor also advises</w:t>
       </w:r>
     </w:p>
     <w:p>
@@ -3966,7 +4094,7 @@
           <w:b w:val="0"/>
           <w:i w:val="0"/>
         </w:rPr>
-        <w:t>Still open: how long does each reflection take?</w:t>
+        <w:t>Minimum team size is 5. Add it to the Honour™ page and the Book Online description (the site only says maximum 9)</w:t>
       </w:r>
     </w:p>
     <w:p>
@@ -3990,7 +4118,7 @@
           <w:b w:val="0"/>
           <w:i w:val="0"/>
         </w:rPr>
-        <w:t>Still open: the minimum team size. The pricing table starts at 5 participants but the website only states a maximum of 9</w:t>
+        <w:t>Add the sponsor rule to the Brief and the site: the sponsor attends only if participants agree</w:t>
       </w:r>
     </w:p>
     <w:p>
@@ -4014,7 +4142,7 @@
           <w:b w:val="0"/>
           <w:i w:val="0"/>
         </w:rPr>
-        <w:t>Still open: the Brief says the findings are "clear and actionable" and that Align happens "before making recommendations", but elsewhere says Honour™ does not prescribe. Decide whether you give recommendations, and use one wording everywhere</w:t>
+        <w:t>Replace "Week 1–2" in the Brief's timeline with the actual pattern: Tuesday, Friday, then the following Wednesday</w:t>
       </w:r>
     </w:p>
     <w:p>
@@ -4038,7 +4166,7 @@
           <w:b w:val="0"/>
           <w:i w:val="0"/>
         </w:rPr>
-        <w:t>Still open: Session 2 is labelled "Week 1–2" in the timeline. Give the exact spacing (for example, Session 1 on day 1, Session 2 on day 6, Session 3 on day 12)</w:t>
+        <w:t>Still to decide: how long each reflection questionnaire takes</w:t>
       </w:r>
     </w:p>
     <w:sectPr>

</xml_diff>

<commit_message>
Add reflection timing to session copy
Co-Authored-By: Claude Sonnet 5.5 <noreply@anthropic.com>
Claude-Session: https://claude.ai/code/session_01VGNF22YqMhet38GotcC9rv
</commit_message>
<xml_diff>
--- a/qa/Website-Fix-and-Improve-List.docx
+++ b/qa/Website-Fix-and-Improve-List.docx
@@ -3754,7 +3754,7 @@
           <w:b w:val="0"/>
           <w:i w:val="0"/>
         </w:rPr>
-        <w:t>Straight after Session 1, each participant receives an email with a link to a short private reflection questionnaire. While they complete it, the session data is synthesised and anonymised. [Say how long it takes, for example about 15 to 20 minutes.]</w:t>
+        <w:t>Straight after Session 1, each participant receives an email with a link to a short private reflection questionnaire. While they complete it, the session data is synthesised and anonymised. It takes about 15 minutes, though you are welcome to sit with it longer. Please complete it by the day before Session 2 (Thursday) at the latest.</w:t>
       </w:r>
     </w:p>
     <w:p>
@@ -3844,7 +3844,7 @@
           <w:b w:val="0"/>
           <w:i w:val="0"/>
         </w:rPr>
-        <w:t>Straight after Session 2, each participant receives an email with a link to a second short private questionnaire, to bring what was aligned into their own context. Meanwhile the directional synthesis is prepared for the final session. [Say how long it takes.]</w:t>
+        <w:t>Straight after Session 2, each participant receives an email with a link to a second short private questionnaire, to bring what was aligned into their own context. Meanwhile the directional synthesis is prepared for the final session. It takes about 15 minutes, though you are welcome to sit with it longer. Please complete it by the day before Session 3 (Tuesday) at the latest.</w:t>
       </w:r>
     </w:p>
     <w:p>
@@ -4166,7 +4166,7 @@
           <w:b w:val="0"/>
           <w:i w:val="0"/>
         </w:rPr>
-        <w:t>Still to decide: how long each reflection questionnaire takes</w:t>
+        <w:t>Add the reflection details to the Brief and the site: about 15 minutes, take longer if you wish, due the day before the next session at the latest</w:t>
       </w:r>
     </w:p>
     <w:sectPr>

</xml_diff>

<commit_message>
Add homepage headline and short Honour section copy
Co-Authored-By: Claude Sonnet 5.5 <noreply@anthropic.com>
Claude-Session: https://claude.ai/code/session_01VGNF22YqMhet38GotcC9rv
</commit_message>
<xml_diff>
--- a/qa/Website-Fix-and-Improve-List.docx
+++ b/qa/Website-Fix-and-Improve-List.docx
@@ -3638,7 +3638,7 @@
           <w:b w:val="0"/>
           <w:i w:val="0"/>
         </w:rPr>
-        <w:t>Honour™ runs over about a week and a half: three 90-minute online sessions on a Tuesday, a Friday and the following Wednesday, with a short private reflection after each of the first two. Between five and nine people take part. Honour™ shows you what is really happening and gives you clear recommendations, so you can decide what to do next.</w:t>
+        <w:t>Honour™ runs over two weeks: three 90-minute online sessions on a Tuesday, a Friday and the following Wednesday, with a short private reflection after each of the first two. Between five and nine people take part. Honour™ shows you what is really happening and gives you clear recommendations, so you can decide what to do next.</w:t>
       </w:r>
     </w:p>
     <w:p>
@@ -4167,6 +4167,445 @@
           <w:i w:val="0"/>
         </w:rPr>
         <w:t>Add the reflection details to the Brief and the site: about 15 minutes, take longer if you wish, due the day before the next session at the latest</w:t>
+      </w:r>
+    </w:p>
+    <w:p>
+      <w:r>
+        <w:br w:type="page"/>
+      </w:r>
+    </w:p>
+    <w:p>
+      <w:r>
+        <w:rPr>
+          <w:rFonts w:ascii="Aptos" w:hAnsi="Aptos"/>
+          <w:b/>
+          <w:i w:val="0"/>
+          <w:color w:val="095656"/>
+          <w:sz w:val="32"/>
+        </w:rPr>
+        <w:t>Website copy: homepage and short Honour™ section</w:t>
+      </w:r>
+    </w:p>
+    <w:p>
+      <w:r>
+        <w:rPr>
+          <w:rFonts w:ascii="Aptos" w:hAnsi="Aptos"/>
+          <w:b w:val="0"/>
+          <w:i/>
+          <w:color w:val="6B6B6B"/>
+          <w:sz w:val="18"/>
+        </w:rPr>
+        <w:t>Drafts for your review. Text in [square brackets] needs your confirmation.</w:t>
+      </w:r>
+    </w:p>
+    <w:p>
+      <w:pPr>
+        <w:keepNext/>
+        <w:spacing w:before="240"/>
+        <w:pBdr>
+          <w:bottom w:val="single" w:sz="8" w:space="1" w:color="C08A2E"/>
+        </w:pBdr>
+      </w:pPr>
+      <w:r>
+        <w:rPr>
+          <w:rFonts w:ascii="Aptos" w:hAnsi="Aptos"/>
+          <w:b/>
+          <w:i w:val="0"/>
+          <w:color w:val="095656"/>
+          <w:sz w:val="26"/>
+        </w:rPr>
+        <w:t>Homepage headline (recommended)</w:t>
+      </w:r>
+    </w:p>
+    <w:p>
+      <w:r>
+        <w:rPr>
+          <w:rFonts w:ascii="Aptos" w:hAnsi="Aptos"/>
+          <w:b/>
+          <w:i w:val="0"/>
+          <w:color w:val="095656"/>
+          <w:sz w:val="24"/>
+        </w:rPr>
+        <w:t>See what is really happening in your team, before you decide what to change.</w:t>
+      </w:r>
+    </w:p>
+    <w:p>
+      <w:pPr>
+        <w:keepNext/>
+        <w:spacing w:before="240"/>
+        <w:pBdr>
+          <w:bottom w:val="single" w:sz="8" w:space="1" w:color="C08A2E"/>
+        </w:pBdr>
+      </w:pPr>
+      <w:r>
+        <w:rPr>
+          <w:rFonts w:ascii="Aptos" w:hAnsi="Aptos"/>
+          <w:b/>
+          <w:i w:val="0"/>
+          <w:color w:val="095656"/>
+          <w:sz w:val="26"/>
+        </w:rPr>
+        <w:t>Homepage opening line</w:t>
+      </w:r>
+    </w:p>
+    <w:p>
+      <w:r>
+        <w:rPr>
+          <w:rFonts w:ascii="Aptos" w:hAnsi="Aptos"/>
+          <w:b w:val="0"/>
+          <w:i w:val="0"/>
+        </w:rPr>
+        <w:t>Honour™ is a facilitated organisational diagnostic for teams of 5 to 9 people: three 90-minute online sessions over two weeks, a clear report for the sponsor and for every participant, and recommendations you can act on. [Founding-cohort places open from 14 October 2026.] From $441 per participant.</w:t>
+      </w:r>
+    </w:p>
+    <w:p>
+      <w:pPr>
+        <w:keepNext/>
+        <w:spacing w:before="240"/>
+        <w:pBdr>
+          <w:bottom w:val="single" w:sz="8" w:space="1" w:color="C08A2E"/>
+        </w:pBdr>
+      </w:pPr>
+      <w:r>
+        <w:rPr>
+          <w:rFonts w:ascii="Aptos" w:hAnsi="Aptos"/>
+          <w:b/>
+          <w:i w:val="0"/>
+          <w:color w:val="095656"/>
+          <w:sz w:val="26"/>
+        </w:rPr>
+        <w:t>Buttons</w:t>
+      </w:r>
+    </w:p>
+    <w:p>
+      <w:r>
+        <w:rPr>
+          <w:rFonts w:ascii="Aptos" w:hAnsi="Aptos"/>
+          <w:b w:val="0"/>
+          <w:i w:val="0"/>
+        </w:rPr>
+        <w:t>Main: Book a 30-minute call. No commitment, no pitch.</w:t>
+      </w:r>
+    </w:p>
+    <w:p>
+      <w:r>
+        <w:rPr>
+          <w:rFonts w:ascii="Aptos" w:hAnsi="Aptos"/>
+          <w:b w:val="0"/>
+          <w:i w:val="0"/>
+        </w:rPr>
+        <w:t>Second: See how Honour™ works</w:t>
+      </w:r>
+    </w:p>
+    <w:p>
+      <w:pPr>
+        <w:keepNext/>
+        <w:spacing w:before="240"/>
+        <w:pBdr>
+          <w:bottom w:val="single" w:sz="8" w:space="1" w:color="C08A2E"/>
+        </w:pBdr>
+      </w:pPr>
+      <w:r>
+        <w:rPr>
+          <w:rFonts w:ascii="Aptos" w:hAnsi="Aptos"/>
+          <w:b/>
+          <w:i w:val="0"/>
+          <w:color w:val="095656"/>
+          <w:sz w:val="26"/>
+        </w:rPr>
+        <w:t>Other headline options</w:t>
+      </w:r>
+    </w:p>
+    <w:p>
+      <w:pPr>
+        <w:keepLines/>
+        <w:ind w:left="510" w:hanging="510"/>
+      </w:pPr>
+      <w:r>
+        <w:rPr>
+          <w:rFonts w:ascii="Aptos" w:hAnsi="Aptos"/>
+          <w:b w:val="0"/>
+          <w:i w:val="0"/>
+          <w:color w:val="095656"/>
+          <w:sz w:val="24"/>
+        </w:rPr>
+        <w:t xml:space="preserve">☐  </w:t>
+      </w:r>
+      <w:r>
+        <w:rPr>
+          <w:rFonts w:ascii="Aptos" w:hAnsi="Aptos"/>
+          <w:b w:val="0"/>
+          <w:i w:val="0"/>
+        </w:rPr>
+        <w:t>Your strategy is sound. Something in the way is not. Honour™ shows you what.</w:t>
+      </w:r>
+    </w:p>
+    <w:p>
+      <w:pPr>
+        <w:keepLines/>
+        <w:ind w:left="510" w:hanging="510"/>
+      </w:pPr>
+      <w:r>
+        <w:rPr>
+          <w:rFonts w:ascii="Aptos" w:hAnsi="Aptos"/>
+          <w:b w:val="0"/>
+          <w:i w:val="0"/>
+          <w:color w:val="095656"/>
+          <w:sz w:val="24"/>
+        </w:rPr>
+        <w:t xml:space="preserve">☐  </w:t>
+      </w:r>
+      <w:r>
+        <w:rPr>
+          <w:rFonts w:ascii="Aptos" w:hAnsi="Aptos"/>
+          <w:b w:val="0"/>
+          <w:i w:val="0"/>
+        </w:rPr>
+        <w:t>A two-week diagnostic that shows where your team is misaligned, and what to do about it.</w:t>
+      </w:r>
+    </w:p>
+    <w:p>
+      <w:pPr>
+        <w:keepLines/>
+        <w:ind w:left="510" w:hanging="510"/>
+      </w:pPr>
+      <w:r>
+        <w:rPr>
+          <w:rFonts w:ascii="Aptos" w:hAnsi="Aptos"/>
+          <w:b w:val="0"/>
+          <w:i w:val="0"/>
+          <w:color w:val="095656"/>
+          <w:sz w:val="24"/>
+        </w:rPr>
+        <w:t xml:space="preserve">☐  </w:t>
+      </w:r>
+      <w:r>
+        <w:rPr>
+          <w:rFonts w:ascii="Aptos" w:hAnsi="Aptos"/>
+          <w:b w:val="0"/>
+          <w:i w:val="0"/>
+        </w:rPr>
+        <w:t>Before your team moves, they need to see clearly. (your current Honour™ page headline, which also works well)</w:t>
+      </w:r>
+    </w:p>
+    <w:p>
+      <w:pPr>
+        <w:keepNext/>
+        <w:spacing w:before="240"/>
+        <w:pBdr>
+          <w:bottom w:val="single" w:sz="8" w:space="1" w:color="C08A2E"/>
+        </w:pBdr>
+      </w:pPr>
+      <w:r>
+        <w:rPr>
+          <w:rFonts w:ascii="Aptos" w:hAnsi="Aptos"/>
+          <w:b/>
+          <w:i w:val="0"/>
+          <w:color w:val="095656"/>
+          <w:sz w:val="26"/>
+        </w:rPr>
+        <w:t>Where the existing lines go</w:t>
+      </w:r>
+    </w:p>
+    <w:p>
+      <w:pPr>
+        <w:keepLines/>
+        <w:ind w:left="510" w:hanging="510"/>
+      </w:pPr>
+      <w:r>
+        <w:rPr>
+          <w:rFonts w:ascii="Aptos" w:hAnsi="Aptos"/>
+          <w:b w:val="0"/>
+          <w:i w:val="0"/>
+          <w:color w:val="095656"/>
+          <w:sz w:val="24"/>
+        </w:rPr>
+        <w:t xml:space="preserve">☐  </w:t>
+      </w:r>
+      <w:r>
+        <w:rPr>
+          <w:rFonts w:ascii="Aptos" w:hAnsi="Aptos"/>
+          <w:b w:val="0"/>
+          <w:i w:val="0"/>
+        </w:rPr>
+        <w:t>Keep "Agile in Practice. Rooted in Progress. Human by Design." as the brand line under the logo or further down the page</w:t>
+      </w:r>
+    </w:p>
+    <w:p>
+      <w:pPr>
+        <w:keepLines/>
+        <w:ind w:left="510" w:hanging="510"/>
+      </w:pPr>
+      <w:r>
+        <w:rPr>
+          <w:rFonts w:ascii="Aptos" w:hAnsi="Aptos"/>
+          <w:b w:val="0"/>
+          <w:i w:val="0"/>
+          <w:color w:val="095656"/>
+          <w:sz w:val="24"/>
+        </w:rPr>
+        <w:t xml:space="preserve">☐  </w:t>
+      </w:r>
+      <w:r>
+        <w:rPr>
+          <w:rFonts w:ascii="Aptos" w:hAnsi="Aptos"/>
+          <w:b w:val="0"/>
+          <w:i w:val="0"/>
+        </w:rPr>
+        <w:t>Move "One step steady, one breath clear" and the W T F? section below the offer and the pricing, once the visitor knows what you sell</w:t>
+      </w:r>
+    </w:p>
+    <w:p>
+      <w:pPr>
+        <w:keepNext/>
+        <w:spacing w:before="240"/>
+        <w:pBdr>
+          <w:bottom w:val="single" w:sz="8" w:space="1" w:color="C08A2E"/>
+        </w:pBdr>
+      </w:pPr>
+      <w:r>
+        <w:rPr>
+          <w:rFonts w:ascii="Aptos" w:hAnsi="Aptos"/>
+          <w:b/>
+          <w:i w:val="0"/>
+          <w:color w:val="095656"/>
+          <w:sz w:val="26"/>
+        </w:rPr>
+        <w:t>Honour™ page: how it works (short version)</w:t>
+      </w:r>
+    </w:p>
+    <w:p>
+      <w:r>
+        <w:rPr>
+          <w:rFonts w:ascii="Aptos" w:hAnsi="Aptos"/>
+          <w:b/>
+          <w:i w:val="0"/>
+          <w:color w:val="C08A2E"/>
+          <w:sz w:val="22"/>
+        </w:rPr>
+        <w:t>How Honour™ works</w:t>
+      </w:r>
+    </w:p>
+    <w:p>
+      <w:r>
+        <w:rPr>
+          <w:rFonts w:ascii="Aptos" w:hAnsi="Aptos"/>
+          <w:b w:val="0"/>
+          <w:i w:val="0"/>
+        </w:rPr>
+        <w:t>Three 90-minute online sessions over two weeks, with a short private reflection after the first two. Five to nine people take part.</w:t>
+      </w:r>
+    </w:p>
+    <w:p>
+      <w:pPr>
+        <w:keepLines/>
+        <w:ind w:left="510" w:hanging="510"/>
+      </w:pPr>
+      <w:r>
+        <w:rPr>
+          <w:rFonts w:ascii="Aptos" w:hAnsi="Aptos"/>
+          <w:b w:val="0"/>
+          <w:i w:val="0"/>
+          <w:color w:val="095656"/>
+          <w:sz w:val="24"/>
+        </w:rPr>
+        <w:t xml:space="preserve">☐  </w:t>
+      </w:r>
+      <w:r>
+        <w:rPr>
+          <w:rFonts w:ascii="Aptos" w:hAnsi="Aptos"/>
+          <w:b w:val="0"/>
+          <w:i w:val="0"/>
+        </w:rPr>
+        <w:t>Session 1, Tuesday: Reveal. We surface the patterns, friction and unspoken concerns behind the meeting narratives.</w:t>
+      </w:r>
+    </w:p>
+    <w:p>
+      <w:pPr>
+        <w:keepLines/>
+        <w:ind w:left="510" w:hanging="510"/>
+      </w:pPr>
+      <w:r>
+        <w:rPr>
+          <w:rFonts w:ascii="Aptos" w:hAnsi="Aptos"/>
+          <w:b w:val="0"/>
+          <w:i w:val="0"/>
+          <w:color w:val="095656"/>
+          <w:sz w:val="24"/>
+        </w:rPr>
+        <w:t xml:space="preserve">☐  </w:t>
+      </w:r>
+      <w:r>
+        <w:rPr>
+          <w:rFonts w:ascii="Aptos" w:hAnsi="Aptos"/>
+          <w:b w:val="0"/>
+          <w:i w:val="0"/>
+        </w:rPr>
+        <w:t>Session 2, Friday: Align. The team reviews the anonymised findings together and maps where the misalignment sits.</w:t>
+      </w:r>
+    </w:p>
+    <w:p>
+      <w:pPr>
+        <w:keepLines/>
+        <w:ind w:left="510" w:hanging="510"/>
+      </w:pPr>
+      <w:r>
+        <w:rPr>
+          <w:rFonts w:ascii="Aptos" w:hAnsi="Aptos"/>
+          <w:b w:val="0"/>
+          <w:i w:val="0"/>
+          <w:color w:val="095656"/>
+          <w:sz w:val="24"/>
+        </w:rPr>
+        <w:t xml:space="preserve">☐  </w:t>
+      </w:r>
+      <w:r>
+        <w:rPr>
+          <w:rFonts w:ascii="Aptos" w:hAnsi="Aptos"/>
+          <w:b w:val="0"/>
+          <w:i w:val="0"/>
+        </w:rPr>
+        <w:t>Session 3, the following Wednesday: Direct. We confirm the picture and share clear recommendations.</w:t>
+      </w:r>
+    </w:p>
+    <w:p>
+      <w:r>
+        <w:rPr>
+          <w:rFonts w:ascii="Aptos" w:hAnsi="Aptos"/>
+          <w:b w:val="0"/>
+          <w:i w:val="0"/>
+        </w:rPr>
+        <w:t>After Sessions 1 and 2, each participant receives an email link to a private 15-minute reflection, due the day before the next session at the latest.</w:t>
+      </w:r>
+    </w:p>
+    <w:p>
+      <w:r>
+        <w:rPr>
+          <w:rFonts w:ascii="Aptos" w:hAnsi="Aptos"/>
+          <w:b w:val="0"/>
+          <w:i w:val="0"/>
+        </w:rPr>
+        <w:t>Within 5 business days, the sponsor receives the anonymised Honour™ Report. Every participant receives their own report and the Gifts of Clarity: a journaling eBooklet and the Double Take Cards.</w:t>
+      </w:r>
+    </w:p>
+    <w:p>
+      <w:r>
+        <w:rPr>
+          <w:rFonts w:ascii="Aptos" w:hAnsi="Aptos"/>
+          <w:b w:val="0"/>
+          <w:i w:val="0"/>
+        </w:rPr>
+        <w:t>The sponsor joins the sessions only if the participants agree. Data is handled in line with POPIA and GDPR.</w:t>
+      </w:r>
+    </w:p>
+    <w:p>
+      <w:r>
+        <w:rPr>
+          <w:rFonts w:ascii="Aptos" w:hAnsi="Aptos"/>
+          <w:b/>
+          <w:i w:val="0"/>
+        </w:rPr>
+        <w:t>From $441 per participant (5 to 9 people, USD; GBP, EUR and ZAR available). 50% deposit to confirm, 50% on report delivery.</w:t>
       </w:r>
     </w:p>
     <w:sectPr>

</xml_diff>

<commit_message>
Use you/we voice in FAQ and add approved FAQ copy to checklist
Co-Authored-By: Claude Sonnet 5.5 <noreply@anthropic.com>
Claude-Session: https://claude.ai/code/session_01VGNF22YqMhet38GotcC9rv
</commit_message>
<xml_diff>
--- a/qa/Website-Fix-and-Improve-List.docx
+++ b/qa/Website-Fix-and-Improve-List.docx
@@ -4606,6 +4606,279 @@
           <w:i w:val="0"/>
         </w:rPr>
         <w:t>From $441 per participant (5 to 9 people, USD; GBP, EUR and ZAR available). 50% deposit to confirm, 50% on report delivery.</w:t>
+      </w:r>
+    </w:p>
+    <w:p>
+      <w:r>
+        <w:br w:type="page"/>
+      </w:r>
+    </w:p>
+    <w:p>
+      <w:r>
+        <w:rPr>
+          <w:rFonts w:ascii="Aptos" w:hAnsi="Aptos"/>
+          <w:b/>
+          <w:i w:val="0"/>
+          <w:color w:val="095656"/>
+          <w:sz w:val="32"/>
+        </w:rPr>
+        <w:t>Honour™ page: Before you decide (approved FAQ copy)</w:t>
+      </w:r>
+    </w:p>
+    <w:p>
+      <w:r>
+        <w:rPr>
+          <w:rFonts w:ascii="Aptos" w:hAnsi="Aptos"/>
+          <w:b w:val="0"/>
+          <w:i/>
+          <w:color w:val="6B6B6B"/>
+          <w:sz w:val="18"/>
+        </w:rPr>
+        <w:t>Approved by you. Voice: "you" for the reader, "we" for Hannie Consultants.</w:t>
+      </w:r>
+    </w:p>
+    <w:p>
+      <w:r>
+        <w:rPr>
+          <w:rFonts w:ascii="Aptos" w:hAnsi="Aptos"/>
+          <w:b/>
+          <w:i w:val="0"/>
+        </w:rPr>
+        <w:t>Straight answers to the questions worth asking before you commit.</w:t>
+      </w:r>
+    </w:p>
+    <w:p>
+      <w:pPr>
+        <w:keepNext/>
+        <w:spacing w:before="160"/>
+      </w:pPr>
+      <w:r>
+        <w:rPr>
+          <w:rFonts w:ascii="Aptos" w:hAnsi="Aptos"/>
+          <w:b/>
+          <w:i w:val="0"/>
+          <w:color w:val="C08A2E"/>
+          <w:sz w:val="22"/>
+        </w:rPr>
+        <w:t>Will your people be honest, and will it be safe for them to be?</w:t>
+      </w:r>
+    </w:p>
+    <w:p>
+      <w:r>
+        <w:rPr>
+          <w:rFonts w:ascii="Aptos" w:hAnsi="Aptos"/>
+          <w:b w:val="0"/>
+          <w:i w:val="0"/>
+        </w:rPr>
+        <w:t>Honour™ only works when people feel safe enough to tell the truth, so it is designed for that. Each participant responds privately as well as in the sessions, and what is shared with the group and with you is anonymised. Participants complete a consent form first, and data is handled in line with POPIA and GDPR. If your team is not ready to engage honestly, we will say so on the discovery call.</w:t>
+      </w:r>
+    </w:p>
+    <w:p>
+      <w:pPr>
+        <w:keepNext/>
+        <w:spacing w:before="160"/>
+      </w:pPr>
+      <w:r>
+        <w:rPr>
+          <w:rFonts w:ascii="Aptos" w:hAnsi="Aptos"/>
+          <w:b/>
+          <w:i w:val="0"/>
+          <w:color w:val="C08A2E"/>
+          <w:sz w:val="22"/>
+        </w:rPr>
+        <w:t>What will you see, and what will your team see?</w:t>
+      </w:r>
+    </w:p>
+    <w:p>
+      <w:r>
+        <w:rPr>
+          <w:rFonts w:ascii="Aptos" w:hAnsi="Aptos"/>
+          <w:b w:val="0"/>
+          <w:i w:val="0"/>
+        </w:rPr>
+        <w:t>You receive the anonymised Honour™ Report, with clear findings and recommendations. Each participant receives only their own individual report. Nobody is singled out.</w:t>
+      </w:r>
+    </w:p>
+    <w:p>
+      <w:pPr>
+        <w:keepNext/>
+        <w:spacing w:before="160"/>
+      </w:pPr>
+      <w:r>
+        <w:rPr>
+          <w:rFonts w:ascii="Aptos" w:hAnsi="Aptos"/>
+          <w:b/>
+          <w:i w:val="0"/>
+          <w:color w:val="C08A2E"/>
+          <w:sz w:val="22"/>
+        </w:rPr>
+        <w:t>Will you be in the sessions?</w:t>
+      </w:r>
+    </w:p>
+    <w:p>
+      <w:r>
+        <w:rPr>
+          <w:rFonts w:ascii="Aptos" w:hAnsi="Aptos"/>
+          <w:b w:val="0"/>
+          <w:i w:val="0"/>
+        </w:rPr>
+        <w:t>Only if the participants agree to it. You remain the leader throughout. Honour™ gives you a clearer picture to lead from; it does not replace your judgement.</w:t>
+      </w:r>
+    </w:p>
+    <w:p>
+      <w:pPr>
+        <w:keepNext/>
+        <w:spacing w:before="160"/>
+      </w:pPr>
+      <w:r>
+        <w:rPr>
+          <w:rFonts w:ascii="Aptos" w:hAnsi="Aptos"/>
+          <w:b/>
+          <w:i w:val="0"/>
+          <w:color w:val="C08A2E"/>
+          <w:sz w:val="22"/>
+        </w:rPr>
+        <w:t>What does it ask of your team's time?</w:t>
+      </w:r>
+    </w:p>
+    <w:p>
+      <w:r>
+        <w:rPr>
+          <w:rFonts w:ascii="Aptos" w:hAnsi="Aptos"/>
+          <w:b w:val="0"/>
+          <w:i w:val="0"/>
+        </w:rPr>
+        <w:t>Three 90-minute online sessions over two weeks, plus two private reflections of about 15 minutes each, sent by email link after Sessions 1 and 2. Reports follow within 5 business days.</w:t>
+      </w:r>
+    </w:p>
+    <w:p>
+      <w:pPr>
+        <w:keepNext/>
+        <w:spacing w:before="160"/>
+      </w:pPr>
+      <w:r>
+        <w:rPr>
+          <w:rFonts w:ascii="Aptos" w:hAnsi="Aptos"/>
+          <w:b/>
+          <w:i w:val="0"/>
+          <w:color w:val="C08A2E"/>
+          <w:sz w:val="22"/>
+        </w:rPr>
+        <w:t>What does it cost, and what is included?</w:t>
+      </w:r>
+    </w:p>
+    <w:p>
+      <w:r>
+        <w:rPr>
+          <w:rFonts w:ascii="Aptos" w:hAnsi="Aptos"/>
+          <w:b w:val="0"/>
+          <w:i w:val="0"/>
+        </w:rPr>
+        <w:t>One rate per participant, from $441 (9 people) to $705 (5 people), with no add-ons or hidden tiers. It includes the three sessions, the sponsor report, individual reports and the Gifts of Clarity. A 50% deposit confirms your booking and the balance is due on report delivery. Honour™ is not offered for fewer than 5 participants.</w:t>
+      </w:r>
+    </w:p>
+    <w:p>
+      <w:pPr>
+        <w:keepNext/>
+        <w:spacing w:before="160"/>
+      </w:pPr>
+      <w:r>
+        <w:rPr>
+          <w:rFonts w:ascii="Aptos" w:hAnsi="Aptos"/>
+          <w:b/>
+          <w:i w:val="0"/>
+          <w:color w:val="C08A2E"/>
+          <w:sz w:val="22"/>
+        </w:rPr>
+        <w:t>Will it be uncomfortable?</w:t>
+      </w:r>
+    </w:p>
+    <w:p>
+      <w:r>
+        <w:rPr>
+          <w:rFonts w:ascii="Aptos" w:hAnsi="Aptos"/>
+          <w:b w:val="0"/>
+          <w:i w:val="0"/>
+        </w:rPr>
+        <w:t>It can be, at first. Honour™ reveals what is truly present, and that is not always easy to hear. That is also where its value lies. The sessions are structured and facilitated, not open-ended, and the process is paced so that nothing is forced.</w:t>
+      </w:r>
+    </w:p>
+    <w:p>
+      <w:pPr>
+        <w:keepNext/>
+        <w:spacing w:before="160"/>
+      </w:pPr>
+      <w:r>
+        <w:rPr>
+          <w:rFonts w:ascii="Aptos" w:hAnsi="Aptos"/>
+          <w:b/>
+          <w:i w:val="0"/>
+          <w:color w:val="C08A2E"/>
+          <w:sz w:val="22"/>
+        </w:rPr>
+        <w:t>What happens after the diagnostic?</w:t>
+      </w:r>
+    </w:p>
+    <w:p>
+      <w:r>
+        <w:rPr>
+          <w:rFonts w:ascii="Aptos" w:hAnsi="Aptos"/>
+          <w:b w:val="0"/>
+          <w:i w:val="0"/>
+        </w:rPr>
+        <w:t>You decide. The report gives you a clear picture and recommendations, and you choose which to act on and when. Honour™ does not include training or implementation, but it is the essential first step before any of those can be effective.</w:t>
+      </w:r>
+    </w:p>
+    <w:p>
+      <w:pPr>
+        <w:keepNext/>
+        <w:spacing w:before="160"/>
+      </w:pPr>
+      <w:r>
+        <w:rPr>
+          <w:rFonts w:ascii="Aptos" w:hAnsi="Aptos"/>
+          <w:b/>
+          <w:i w:val="0"/>
+          <w:color w:val="C08A2E"/>
+          <w:sz w:val="22"/>
+        </w:rPr>
+        <w:t>What if your team has more than 9 people?</w:t>
+      </w:r>
+    </w:p>
+    <w:p>
+      <w:r>
+        <w:rPr>
+          <w:rFonts w:ascii="Aptos" w:hAnsi="Aptos"/>
+          <w:b w:val="0"/>
+          <w:i w:val="0"/>
+        </w:rPr>
+        <w:t>Another Honour™ Diagnostic can be commissioned for a second group. This also surfaces cross-team dynamics that one large session would miss.</w:t>
+      </w:r>
+    </w:p>
+    <w:p>
+      <w:pPr>
+        <w:keepNext/>
+        <w:spacing w:before="160"/>
+      </w:pPr>
+      <w:r>
+        <w:rPr>
+          <w:rFonts w:ascii="Aptos" w:hAnsi="Aptos"/>
+          <w:b/>
+          <w:i w:val="0"/>
+          <w:color w:val="C08A2E"/>
+          <w:sz w:val="22"/>
+        </w:rPr>
+        <w:t>How do you know it is the right fit before you commit?</w:t>
+      </w:r>
+    </w:p>
+    <w:p>
+      <w:r>
+        <w:rPr>
+          <w:rFonts w:ascii="Aptos" w:hAnsi="Aptos"/>
+          <w:b w:val="0"/>
+          <w:i w:val="0"/>
+        </w:rPr>
+        <w:t>Book the free 30-minute discovery call. You share your context and we confirm together whether Honour™ is right for your team, its timing and its scope. If it is not, we will tell you honestly.</w:t>
       </w:r>
     </w:p>
     <w:sectPr>

</xml_diff>

<commit_message>
Update Honour FAQ (collapsible answers) in mock-up and checklist
Co-Authored-By: Claude Sonnet 5.5 <noreply@anthropic.com>
Claude-Session: https://claude.ai/code/session_01VGNF22YqMhet38GotcC9rv
</commit_message>
<xml_diff>
--- a/qa/Website-Fix-and-Improve-List.docx
+++ b/qa/Website-Fix-and-Improve-List.docx
@@ -4634,7 +4634,7 @@
           <w:color w:val="6B6B6B"/>
           <w:sz w:val="18"/>
         </w:rPr>
-        <w:t>Approved by you. Voice: "you" for the reader, "we" for Hannie Consultants.</w:t>
+        <w:t>Approved by you. Voice: "you" for the reader, "we" for Hannie Consultants. Answers start with the key point, so the first 3 lines stand alone in the Wix Collapsible Text Box. Set each box’s button text to "Read the full answer" and "Show less", and its Accessible name to the question.</w:t>
       </w:r>
     </w:p>
     <w:p>
@@ -4670,7 +4670,7 @@
           <w:b w:val="0"/>
           <w:i w:val="0"/>
         </w:rPr>
-        <w:t>Honour™ only works when people feel safe enough to tell the truth, so it is designed for that. Each participant responds privately as well as in the sessions, and what is shared with the group and with you is anonymised. Participants complete a consent form first, and data is handled in line with POPIA and GDPR. If your team is not ready to engage honestly, we will say so on the discovery call.</w:t>
+        <w:t>Honour™ is designed so that people can tell the truth safely. Each participant responds privately as well as in the sessions, and what is shared with the group and with you is anonymised. Participants complete a consent form first, and data is handled according to POPIA and GDPR. If your team is not ready to engage honestly, please indicate so during the discovery call.</w:t>
       </w:r>
     </w:p>
     <w:p>
@@ -4696,7 +4696,7 @@
           <w:b w:val="0"/>
           <w:i w:val="0"/>
         </w:rPr>
-        <w:t>You receive the anonymised Honour™ Report, with clear findings and recommendations. Each participant receives only their own individual report. Nobody is singled out.</w:t>
+        <w:t>You receive an anonymised organisational report, and each participant receives only their own individual report. The Honour™ Report contains findings and recommendations, with no names attached to any finding. Individual reports are delivered separately and are not shared with you. Nobody is singled out.</w:t>
       </w:r>
     </w:p>
     <w:p>
@@ -4722,7 +4722,7 @@
           <w:b w:val="0"/>
           <w:i w:val="0"/>
         </w:rPr>
-        <w:t>Only if the participants agree to it. You remain the leader throughout. Honour™ gives you a clearer picture to lead from; it does not replace your judgement.</w:t>
+        <w:t>Only if the participants agree to it. You remain the leader throughout. Honour™ gives you a clearer picture to lead from, and it does not replace your judgement.</w:t>
       </w:r>
     </w:p>
     <w:p>
@@ -4748,7 +4748,7 @@
           <w:b w:val="0"/>
           <w:i w:val="0"/>
         </w:rPr>
-        <w:t>Three 90-minute online sessions over two weeks, plus two private reflections of about 15 minutes each, sent by email link after Sessions 1 and 2. Reports follow within 5 business days.</w:t>
+        <w:t>About five hours per participant in total, spread over two weeks, plus a short intake form beforehand. That is three 90-minute online sessions, held on a Tuesday, a Friday and the following Wednesday, and two private reflections of about 15 minutes each. After Sessions 1 and 2, each participant receives an email link to a reflection, due the day before the next session at the latest. Reports follow within 5 business days of the final session.</w:t>
       </w:r>
     </w:p>
     <w:p>
@@ -4774,7 +4774,7 @@
           <w:b w:val="0"/>
           <w:i w:val="0"/>
         </w:rPr>
-        <w:t>One rate per participant, from $441 (9 people) to $705 (5 people), with no add-ons or hidden tiers. It includes the three sessions, the sponsor report, individual reports and the Gifts of Clarity. A 50% deposit confirms your booking and the balance is due on report delivery. Honour™ is not offered for fewer than 5 participants.</w:t>
+        <w:t>From $441 per participant (9 people) to $705 per participant (5 people), with no add-ons or hidden tiers. That one rate includes the three facilitated sessions, the sponsor report, individual participant reports and the Gifts of Clarity. A 50% deposit confirms your booking, and the balance is due on report delivery. Honour™ is not offered for fewer than 5 participants. Prices are in USD, with GBP, EUR and ZAR available.</w:t>
       </w:r>
     </w:p>
     <w:p>
@@ -4826,7 +4826,7 @@
           <w:b w:val="0"/>
           <w:i w:val="0"/>
         </w:rPr>
-        <w:t>You decide. The report gives you a clear picture and recommendations, and you choose which to act on and when. Honour™ does not include training or implementation, but it is the essential first step before any of those can be effective.</w:t>
+        <w:t>You decide what happens next. The report gives you a clear picture and recommendations, and you choose which to act on and when. Honour™ does not include training or implementation, but it is the essential first step before any of those can be effective.</w:t>
       </w:r>
     </w:p>
     <w:p>

</xml_diff>